<commit_message>
Complete Week 7 Activites
</commit_message>
<xml_diff>
--- a/week7/Stage_4_Lab_Student_Handout.docx
+++ b/week7/Stage_4_Lab_Student_Handout.docx
@@ -1,6 +1,6 @@
 
 <file path=word/document.xml><?xml version="1.0" encoding="utf-8"?>
-<w:document xmlns:wpc="http://schemas.microsoft.com/office/word/2010/wordprocessingCanvas" xmlns:cx="http://schemas.microsoft.com/office/drawing/2014/chartex" xmlns:cx1="http://schemas.microsoft.com/office/drawing/2015/9/8/chartex" xmlns:cx2="http://schemas.microsoft.com/office/drawing/2015/10/21/chartex" xmlns:cx3="http://schemas.microsoft.com/office/drawing/2016/5/9/chartex" xmlns:cx4="http://schemas.microsoft.com/office/drawing/2016/5/10/chartex" xmlns:cx5="http://schemas.microsoft.com/office/drawing/2016/5/11/chartex" xmlns:cx6="http://schemas.microsoft.com/office/drawing/2016/5/12/chartex" xmlns:cx7="http://schemas.microsoft.com/office/drawing/2016/5/13/chartex" xmlns:cx8="http://schemas.microsoft.com/office/drawing/2016/5/14/chartex" xmlns:mc="http://schemas.openxmlformats.org/markup-compatibility/2006" xmlns:aink="http://schemas.microsoft.com/office/drawing/2016/ink" xmlns:am3d="http://schemas.microsoft.com/office/drawing/2017/model3d" xmlns:o="urn:schemas-microsoft-com:office:office" xmlns:oel="http://schemas.microsoft.com/office/2019/extlst" xmlns:r="http://schemas.openxmlformats.org/officeDocument/2006/relationships" xmlns:m="http://schemas.openxmlformats.org/officeDocument/2006/math" xmlns:v="urn:schemas-microsoft-com:vml" xmlns:wp14="http://schemas.microsoft.com/office/word/2010/wordprocessingDrawing" xmlns:wp="http://schemas.openxmlformats.org/drawingml/2006/wordprocessingDrawing" xmlns:w10="urn:schemas-microsoft-com:office:word" xmlns:w="http://schemas.openxmlformats.org/wordprocessingml/2006/main" xmlns:w14="http://schemas.microsoft.com/office/word/2010/wordml" xmlns:w15="http://schemas.microsoft.com/office/word/2012/wordml" xmlns:w16cei="http://schemas.microsoft.com/office/word/2026/wordml/cei" xmlns:w16cex="http://schemas.microsoft.com/office/word/2018/wordml/cex" xmlns:w16cid="http://schemas.microsoft.com/office/word/2016/wordml/cid" xmlns:w16="http://schemas.microsoft.com/office/word/2018/wordml" xmlns:w16du="http://schemas.microsoft.com/office/word/2023/wordml/word16du" xmlns:w16sdtdh="http://schemas.microsoft.com/office/word/2020/wordml/sdtdatahash" xmlns:w16sdtfl="http://schemas.microsoft.com/office/word/2024/wordml/sdtformatlock" xmlns:w16se="http://schemas.microsoft.com/office/word/2015/wordml/symex" xmlns:wpg="http://schemas.microsoft.com/office/word/2010/wordprocessingGroup" xmlns:wpi="http://schemas.microsoft.com/office/word/2010/wordprocessingInk" xmlns:wne="http://schemas.microsoft.com/office/word/2006/wordml" xmlns:wps="http://schemas.microsoft.com/office/word/2010/wordprocessingShape" mc:Ignorable="w14 w15 w16se w16cid w16 w16cex w16sdtdh w16sdtfl w16du wp14">
+<w:document xmlns:wpc="http://schemas.microsoft.com/office/word/2010/wordprocessingCanvas" xmlns:cx="http://schemas.microsoft.com/office/drawing/2014/chartex" xmlns:cx1="http://schemas.microsoft.com/office/drawing/2015/9/8/chartex" xmlns:cx2="http://schemas.microsoft.com/office/drawing/2015/10/21/chartex" xmlns:cx3="http://schemas.microsoft.com/office/drawing/2016/5/9/chartex" xmlns:cx4="http://schemas.microsoft.com/office/drawing/2016/5/10/chartex" xmlns:cx5="http://schemas.microsoft.com/office/drawing/2016/5/11/chartex" xmlns:cx6="http://schemas.microsoft.com/office/drawing/2016/5/12/chartex" xmlns:cx7="http://schemas.microsoft.com/office/drawing/2016/5/13/chartex" xmlns:cx8="http://schemas.microsoft.com/office/drawing/2016/5/14/chartex" xmlns:mc="http://schemas.openxmlformats.org/markup-compatibility/2006" xmlns:aink="http://schemas.microsoft.com/office/drawing/2016/ink" xmlns:am3d="http://schemas.microsoft.com/office/drawing/2017/model3d" xmlns:o="urn:schemas-microsoft-com:office:office" xmlns:oel="http://schemas.microsoft.com/office/2019/extlst" xmlns:r="http://schemas.openxmlformats.org/officeDocument/2006/relationships" xmlns:m="http://schemas.openxmlformats.org/officeDocument/2006/math" xmlns:v="urn:schemas-microsoft-com:vml" xmlns:wp14="http://schemas.microsoft.com/office/word/2010/wordprocessingDrawing" xmlns:wp="http://schemas.openxmlformats.org/drawingml/2006/wordprocessingDrawing" xmlns:w10="urn:schemas-microsoft-com:office:word" xmlns:w="http://schemas.openxmlformats.org/wordprocessingml/2006/main" xmlns:w14="http://schemas.microsoft.com/office/word/2010/wordml" xmlns:w15="http://schemas.microsoft.com/office/word/2012/wordml" xmlns:w16cex="http://schemas.microsoft.com/office/word/2018/wordml/cex" xmlns:w16cid="http://schemas.microsoft.com/office/word/2016/wordml/cid" xmlns:w16="http://schemas.microsoft.com/office/word/2018/wordml" xmlns:w16du="http://schemas.microsoft.com/office/word/2023/wordml/word16du" xmlns:w16sdtdh="http://schemas.microsoft.com/office/word/2020/wordml/sdtdatahash" xmlns:w16sdtfl="http://schemas.microsoft.com/office/word/2024/wordml/sdtformatlock" xmlns:w16se="http://schemas.microsoft.com/office/word/2015/wordml/symex" xmlns:wpg="http://schemas.microsoft.com/office/word/2010/wordprocessingGroup" xmlns:wpi="http://schemas.microsoft.com/office/word/2010/wordprocessingInk" xmlns:wne="http://schemas.microsoft.com/office/word/2006/wordml" xmlns:wps="http://schemas.microsoft.com/office/word/2010/wordprocessingShape" mc:Ignorable="w14 w15 w16se w16cid w16 w16cex w16sdtdh w16sdtfl w16du wp14">
   <w:body>
     <w:p>
       <w:pPr>
@@ -56,20 +56,311 @@
         <w:t>Confirm responsibilities, attributes and relationships before coding.</w:t>
       </w:r>
     </w:p>
+    <w:tbl>
+      <w:tblPr>
+        <w:tblStyle w:val="TableGrid"/>
+        <w:tblW w:w="10881" w:type="dxa"/>
+        <w:tblLook w:val="04A0" w:firstRow="1" w:lastRow="0" w:firstColumn="1" w:lastColumn="0" w:noHBand="0" w:noVBand="1"/>
+      </w:tblPr>
+      <w:tblGrid>
+        <w:gridCol w:w="2338"/>
+        <w:gridCol w:w="2420"/>
+        <w:gridCol w:w="3180"/>
+        <w:gridCol w:w="2943"/>
+      </w:tblGrid>
+      <w:tr>
+        <w:tc>
+          <w:tcPr>
+            <w:tcW w:w="2338" w:type="dxa"/>
+          </w:tcPr>
+          <w:p>
+            <w:r>
+              <w:t>Class</w:t>
+            </w:r>
+          </w:p>
+        </w:tc>
+        <w:tc>
+          <w:tcPr>
+            <w:tcW w:w="2420" w:type="dxa"/>
+          </w:tcPr>
+          <w:p>
+            <w:r>
+              <w:t>Attributes</w:t>
+            </w:r>
+          </w:p>
+        </w:tc>
+        <w:tc>
+          <w:tcPr>
+            <w:tcW w:w="3180" w:type="dxa"/>
+          </w:tcPr>
+          <w:p>
+            <w:r>
+              <w:t>Relationships</w:t>
+            </w:r>
+          </w:p>
+        </w:tc>
+        <w:tc>
+          <w:tcPr>
+            <w:tcW w:w="2943" w:type="dxa"/>
+          </w:tcPr>
+          <w:p>
+            <w:r>
+              <w:t>Responsibility</w:t>
+            </w:r>
+          </w:p>
+        </w:tc>
+      </w:tr>
+      <w:tr>
+        <w:tc>
+          <w:tcPr>
+            <w:tcW w:w="2338" w:type="dxa"/>
+          </w:tcPr>
+          <w:p>
+            <w:r>
+              <w:t>Patient</w:t>
+            </w:r>
+          </w:p>
+        </w:tc>
+        <w:tc>
+          <w:tcPr>
+            <w:tcW w:w="2420" w:type="dxa"/>
+          </w:tcPr>
+          <w:p>
+            <w:proofErr w:type="spellStart"/>
+            <w:r>
+              <w:t>patient_id</w:t>
+            </w:r>
+            <w:proofErr w:type="spellEnd"/>
+            <w:r>
+              <w:t xml:space="preserve">, name, phone, </w:t>
+            </w:r>
+            <w:proofErr w:type="spellStart"/>
+            <w:r>
+              <w:t>reminders_opt_in</w:t>
+            </w:r>
+            <w:proofErr w:type="spellEnd"/>
+          </w:p>
+        </w:tc>
+        <w:tc>
+          <w:tcPr>
+            <w:tcW w:w="3180" w:type="dxa"/>
+          </w:tcPr>
+          <w:p>
+            <w:proofErr w:type="spellStart"/>
+            <w:r>
+              <w:t>b</w:t>
+            </w:r>
+            <w:r>
+              <w:t>ook_appointment</w:t>
+            </w:r>
+            <w:proofErr w:type="spellEnd"/>
+            <w:r>
+              <w:t xml:space="preserve">(), </w:t>
+            </w:r>
+            <w:proofErr w:type="spellStart"/>
+            <w:r>
+              <w:t>view_upcoming_appointment</w:t>
+            </w:r>
+            <w:r>
+              <w:t>s</w:t>
+            </w:r>
+            <w:proofErr w:type="spellEnd"/>
+            <w:r>
+              <w:t xml:space="preserve">(), </w:t>
+            </w:r>
+            <w:proofErr w:type="spellStart"/>
+            <w:r>
+              <w:t>opt_in_reminders</w:t>
+            </w:r>
+            <w:proofErr w:type="spellEnd"/>
+            <w:r>
+              <w:t>()</w:t>
+            </w:r>
+          </w:p>
+        </w:tc>
+        <w:tc>
+          <w:tcPr>
+            <w:tcW w:w="2943" w:type="dxa"/>
+          </w:tcPr>
+          <w:p>
+            <w:r>
+              <w:t>Booking with a practitioner</w:t>
+            </w:r>
+            <w:r>
+              <w:t xml:space="preserve"> (FR-01), view own upcoming appointments (FR-04), opt in to reminders (FR-05)</w:t>
+            </w:r>
+            <w:r>
+              <w:t>.</w:t>
+            </w:r>
+          </w:p>
+        </w:tc>
+      </w:tr>
+      <w:tr>
+        <w:tc>
+          <w:tcPr>
+            <w:tcW w:w="2338" w:type="dxa"/>
+          </w:tcPr>
+          <w:p>
+            <w:r>
+              <w:t>Practitioner</w:t>
+            </w:r>
+          </w:p>
+        </w:tc>
+        <w:tc>
+          <w:tcPr>
+            <w:tcW w:w="2420" w:type="dxa"/>
+          </w:tcPr>
+          <w:p>
+            <w:proofErr w:type="spellStart"/>
+            <w:r>
+              <w:t>p</w:t>
+            </w:r>
+            <w:r>
+              <w:t>ractitioner_id</w:t>
+            </w:r>
+            <w:proofErr w:type="spellEnd"/>
+            <w:r>
+              <w:t>, name</w:t>
+            </w:r>
+          </w:p>
+        </w:tc>
+        <w:tc>
+          <w:tcPr>
+            <w:tcW w:w="3180" w:type="dxa"/>
+          </w:tcPr>
+          <w:p>
+            <w:proofErr w:type="spellStart"/>
+            <w:r>
+              <w:t>get_schedule</w:t>
+            </w:r>
+            <w:proofErr w:type="spellEnd"/>
+            <w:r>
+              <w:t xml:space="preserve">(view), </w:t>
+            </w:r>
+            <w:proofErr w:type="spellStart"/>
+            <w:r>
+              <w:t>has_conflict</w:t>
+            </w:r>
+            <w:proofErr w:type="spellEnd"/>
+            <w:r>
+              <w:t xml:space="preserve">(when), </w:t>
+            </w:r>
+            <w:proofErr w:type="spellStart"/>
+            <w:r>
+              <w:t>update_status</w:t>
+            </w:r>
+            <w:proofErr w:type="spellEnd"/>
+            <w:r>
+              <w:t>(appt, status)</w:t>
+            </w:r>
+          </w:p>
+        </w:tc>
+        <w:tc>
+          <w:tcPr>
+            <w:tcW w:w="2943" w:type="dxa"/>
+          </w:tcPr>
+          <w:p>
+            <w:r>
+              <w:t>Keep own schedule</w:t>
+            </w:r>
+            <w:r>
+              <w:t xml:space="preserve"> (FR-03), update live status</w:t>
+            </w:r>
+            <w:r>
+              <w:t xml:space="preserve"> (FR-06)</w:t>
+            </w:r>
+          </w:p>
+        </w:tc>
+      </w:tr>
+      <w:tr>
+        <w:tc>
+          <w:tcPr>
+            <w:tcW w:w="2338" w:type="dxa"/>
+          </w:tcPr>
+          <w:p>
+            <w:r>
+              <w:t>App</w:t>
+            </w:r>
+            <w:r>
+              <w:t>o</w:t>
+            </w:r>
+            <w:r>
+              <w:t>intment</w:t>
+            </w:r>
+          </w:p>
+        </w:tc>
+        <w:tc>
+          <w:tcPr>
+            <w:tcW w:w="2420" w:type="dxa"/>
+          </w:tcPr>
+          <w:p>
+            <w:proofErr w:type="spellStart"/>
+            <w:r>
+              <w:t>a</w:t>
+            </w:r>
+            <w:r>
+              <w:t>ppointment_id</w:t>
+            </w:r>
+            <w:proofErr w:type="spellEnd"/>
+            <w:r>
+              <w:t>, when, status</w:t>
+            </w:r>
+          </w:p>
+        </w:tc>
+        <w:tc>
+          <w:tcPr>
+            <w:tcW w:w="3180" w:type="dxa"/>
+          </w:tcPr>
+          <w:p>
+            <w:r>
+              <w:t>validate(), cancel(), reschedule</w:t>
+            </w:r>
+            <w:r>
+              <w:t>(</w:t>
+            </w:r>
+            <w:proofErr w:type="spellStart"/>
+            <w:r>
+              <w:t>new_when</w:t>
+            </w:r>
+            <w:proofErr w:type="spellEnd"/>
+            <w:r>
+              <w:t xml:space="preserve">), </w:t>
+            </w:r>
+            <w:proofErr w:type="spellStart"/>
+            <w:r>
+              <w:t>record_outcome</w:t>
+            </w:r>
+            <w:proofErr w:type="spellEnd"/>
+            <w:r>
+              <w:t>(outcome)</w:t>
+            </w:r>
+          </w:p>
+        </w:tc>
+        <w:tc>
+          <w:tcPr>
+            <w:tcW w:w="2943" w:type="dxa"/>
+          </w:tcPr>
+          <w:p>
+            <w:r>
+              <w:t xml:space="preserve">Hold patient, practitioner, time and status; validate itself, </w:t>
+            </w:r>
+            <w:r>
+              <w:t>cancel, reschedule and record its outcome (FR-08, FR-09)</w:t>
+            </w:r>
+          </w:p>
+        </w:tc>
+      </w:tr>
+    </w:tbl>
+    <w:p/>
     <w:p>
-      <w:pPr>
-        <w:pStyle w:val="Heading1"/>
-      </w:pPr>
-      <w:r>
-        <w:t>B - Implement Patient: AI OFF</w:t>
-      </w:r>
-    </w:p>
-    <w:p>
-      <w:r>
-        <w:t>Implement Patient with type hints and basic validation.</w:t>
-      </w:r>
-      <w:r>
-        <w:t xml:space="preserve"> </w:t>
+      <w:r>
+        <w:t>Relationships</w:t>
+      </w:r>
+      <w:r>
+        <w:t>: Patient is 1 to 0..* Appointment</w:t>
+      </w:r>
+      <w:r>
+        <w:t>; Practitioner 1 to 0..* Appointment. Plain associations only, no inheritance and no clinic class</w:t>
       </w:r>
     </w:p>
     <w:p>
@@ -77,12 +368,121 @@
         <w:pStyle w:val="Heading1"/>
       </w:pPr>
       <w:r>
-        <w:t>C - Implement Practitioner: AI OFF</w:t>
+        <w:t>B - Implement Patient: AI OFF</w:t>
       </w:r>
     </w:p>
     <w:p>
       <w:r>
-        <w:t>Implement Practitioner with identifier, name and specialty; no database logic.</w:t>
+        <w:t>Implement Patient with type hints and basic validation.</w:t>
+      </w:r>
+      <w:r>
+        <w:t xml:space="preserve"> </w:t>
+      </w:r>
+    </w:p>
+    <w:p>
+      <w:pPr>
+        <w:pStyle w:val="Heading2"/>
+      </w:pPr>
+      <w:r>
+        <w:t>Patient Class</w:t>
+      </w:r>
+      <w:r>
+        <w:t xml:space="preserve"> – From Skeleton</w:t>
+      </w:r>
+    </w:p>
+    <w:p>
+      <w:r>
+        <w:t xml:space="preserve">Each attribute should be stored </w:t>
+      </w:r>
+      <w:r>
+        <w:t xml:space="preserve">privately, and exposed through </w:t>
+      </w:r>
+      <w:r>
+        <w:t>read</w:t>
+      </w:r>
+      <w:r>
+        <w:t xml:space="preserve">-only property, so a validated value cannot be </w:t>
+      </w:r>
+      <w:r>
+        <w:t>overwritten from</w:t>
+      </w:r>
+      <w:r>
+        <w:t xml:space="preserve"> outside</w:t>
+      </w:r>
+      <w:r>
+        <w:t>. p.name still reads exactly as before.</w:t>
+      </w:r>
+      <w:r>
+        <w:br/>
+        <w:t>Basic validation</w:t>
+      </w:r>
+      <w:r>
+        <w:t xml:space="preserve"> in __</w:t>
+      </w:r>
+      <w:proofErr w:type="spellStart"/>
+      <w:r>
+        <w:t>init</w:t>
+      </w:r>
+      <w:proofErr w:type="spellEnd"/>
+      <w:r>
+        <w:t xml:space="preserve">__: </w:t>
+      </w:r>
+      <w:proofErr w:type="spellStart"/>
+      <w:r>
+        <w:t>patient_id</w:t>
+      </w:r>
+      <w:proofErr w:type="spellEnd"/>
+      <w:r>
+        <w:t xml:space="preserve">, name, and phone must be non-empty text, and </w:t>
+      </w:r>
+      <w:proofErr w:type="spellStart"/>
+      <w:r>
+        <w:t>reminders_opt_in</w:t>
+      </w:r>
+      <w:proofErr w:type="spellEnd"/>
+      <w:r>
+        <w:t xml:space="preserve"> must be True or False. A helper </w:t>
+      </w:r>
+      <w:proofErr w:type="spellStart"/>
+      <w:r>
+        <w:t>require_text</w:t>
+      </w:r>
+      <w:proofErr w:type="spellEnd"/>
+      <w:r>
+        <w:t>, can do the check so it is not repeated.</w:t>
+      </w:r>
+      <w:r>
+        <w:br/>
+      </w:r>
+      <w:proofErr w:type="spellStart"/>
+      <w:r>
+        <w:t>opt_in_for_reminders</w:t>
+      </w:r>
+      <w:proofErr w:type="spellEnd"/>
+      <w:r>
+        <w:t>() is implemented</w:t>
+      </w:r>
+      <w:r>
+        <w:t xml:space="preserve"> with the same Ture/False check, </w:t>
+      </w:r>
+      <w:proofErr w:type="spellStart"/>
+      <w:r>
+        <w:t>book_appointment</w:t>
+      </w:r>
+      <w:proofErr w:type="spellEnd"/>
+      <w:r>
+        <w:t xml:space="preserve">() and </w:t>
+      </w:r>
+      <w:proofErr w:type="spellStart"/>
+      <w:r>
+        <w:t>view_upcoming_appointments</w:t>
+      </w:r>
+      <w:proofErr w:type="spellEnd"/>
+      <w:r>
+        <w:t>() are still</w:t>
+      </w:r>
+      <w:r>
+        <w:t xml:space="preserve"> stubs.</w:t>
       </w:r>
     </w:p>
     <w:p>
@@ -90,12 +490,76 @@
         <w:pStyle w:val="Heading1"/>
       </w:pPr>
       <w:r>
-        <w:t>D - Implement Appointment: AI ON</w:t>
+        <w:t>C - Implement Practitioner: AI OFF</w:t>
       </w:r>
     </w:p>
     <w:p>
       <w:r>
-        <w:t>Give AI the approved Appointment UML, business rules and explicit constraints. Ask it to implement only Appointment and agreed enum/exception.</w:t>
+        <w:t>Implement Practitioner with identifier, name and specialty; no database logic.</w:t>
+      </w:r>
+    </w:p>
+    <w:p>
+      <w:pPr>
+        <w:pStyle w:val="Heading2"/>
+      </w:pPr>
+      <w:r>
+        <w:lastRenderedPageBreak/>
+        <w:t>Practitioner Class – From Skeleton</w:t>
+      </w:r>
+    </w:p>
+    <w:p>
+      <w:r>
+        <w:t>Prompt asks for an identifier, name, and specialty</w:t>
+      </w:r>
+      <w:r>
+        <w:t>, so a specialty is added</w:t>
+      </w:r>
+      <w:r>
+        <w:t>. All 3 can be validated as non-empty texts using the same helper from part B</w:t>
+      </w:r>
+      <w:r>
+        <w:t>.</w:t>
+      </w:r>
+      <w:r>
+        <w:br/>
+      </w:r>
+      <w:proofErr w:type="spellStart"/>
+      <w:r>
+        <w:t>has_conflict</w:t>
+      </w:r>
+      <w:proofErr w:type="spellEnd"/>
+      <w:r>
+        <w:t xml:space="preserve">(when) and </w:t>
+      </w:r>
+      <w:proofErr w:type="spellStart"/>
+      <w:r>
+        <w:t>update_status</w:t>
+      </w:r>
+      <w:proofErr w:type="spellEnd"/>
+      <w:r>
+        <w:t>(appointment, status) are restored as two separate operations, as decided</w:t>
+      </w:r>
+      <w:r>
+        <w:t xml:space="preserve"> in part A. Both will remain stubs. </w:t>
+      </w:r>
+      <w:proofErr w:type="spellStart"/>
+      <w:r>
+        <w:t>Update_status</w:t>
+      </w:r>
+      <w:proofErr w:type="spellEnd"/>
+      <w:r>
+        <w:t xml:space="preserve"> takes its status as a plain str</w:t>
+      </w:r>
+      <w:r>
+        <w:t>, because it has no status type yet.</w:t>
+      </w:r>
+      <w:r>
+        <w:br/>
+        <w:t>The appointments list is kept the same</w:t>
+      </w:r>
+      <w:r>
+        <w:br/>
+        <w:t>No database logic, the practitioner only holds its own in-memory list.</w:t>
       </w:r>
     </w:p>
     <w:p>
@@ -103,12 +567,102 @@
         <w:pStyle w:val="Heading1"/>
       </w:pPr>
       <w:r>
-        <w:t>E - Review Generated Code</w:t>
+        <w:t>D - Implement Appointment: AI ON</w:t>
       </w:r>
     </w:p>
     <w:p>
       <w:r>
-        <w:t>Check model consistency, unsupported features, public state mutation, unnecessary inheritance, invented dependencies and error handling.</w:t>
+        <w:t xml:space="preserve">Give AI the approved Appointment UML, business rules and explicit constraints. Ask it to implement only Appointment and agreed </w:t>
+      </w:r>
+      <w:proofErr w:type="spellStart"/>
+      <w:r>
+        <w:t>enum</w:t>
+      </w:r>
+      <w:proofErr w:type="spellEnd"/>
+      <w:r>
+        <w:t>/exception.</w:t>
+      </w:r>
+    </w:p>
+    <w:p>
+      <w:pPr>
+        <w:pStyle w:val="Heading2"/>
+      </w:pPr>
+      <w:r>
+        <w:t>Prompt</w:t>
+      </w:r>
+    </w:p>
+    <w:p>
+      <w:r>
+        <w:t>Act as a Python pair programmer. Implement only the Appointment class from the approved</w:t>
+      </w:r>
+      <w:r>
+        <w:t xml:space="preserve"> </w:t>
+      </w:r>
+      <w:r>
+        <w:t xml:space="preserve">SmartCare UML, plus an </w:t>
+      </w:r>
+      <w:proofErr w:type="spellStart"/>
+      <w:r>
+        <w:t>AppointmentStatus</w:t>
+      </w:r>
+      <w:proofErr w:type="spellEnd"/>
+      <w:r>
+        <w:t xml:space="preserve"> </w:t>
+      </w:r>
+      <w:proofErr w:type="spellStart"/>
+      <w:r>
+        <w:t>enum</w:t>
+      </w:r>
+      <w:proofErr w:type="spellEnd"/>
+      <w:r>
+        <w:t xml:space="preserve"> and one exception for illegal status</w:t>
+      </w:r>
+      <w:r>
+        <w:t xml:space="preserve"> </w:t>
+      </w:r>
+      <w:r>
+        <w:t>changes. Use type hints. Cancelled appointments remain as objects. Do not add database,</w:t>
+      </w:r>
+      <w:r>
+        <w:t xml:space="preserve"> </w:t>
+      </w:r>
+      <w:r>
+        <w:t>UI, notification or service classes. Protect status transitions and explain any decision</w:t>
+      </w:r>
+      <w:r>
+        <w:t xml:space="preserve"> </w:t>
+      </w:r>
+      <w:r>
+        <w:t xml:space="preserve">not directly visible in the UML. </w:t>
+      </w:r>
+    </w:p>
+    <w:p>
+      <w:r>
+        <w:t>Business rules: a new appointment starts SCHEDULED; SCHEDULED may become RUNNING_LATE,</w:t>
+      </w:r>
+      <w:r>
+        <w:br/>
+      </w:r>
+      <w:r>
+        <w:t>CANCELLED, COMPLETED or NO_SHOW; RUNNING_LATE may become CANCELLED, COMPLETED or NO_SHOW;</w:t>
+      </w:r>
+      <w:r>
+        <w:br/>
+      </w:r>
+      <w:r>
+        <w:t>CANCELLED, COMPLETED and NO_SHOW are final.</w:t>
+      </w:r>
+      <w:r>
+        <w:br/>
+      </w:r>
+      <w:r>
+        <w:t>Constraints: standard library only; no inheritance; status must not be publicly</w:t>
+      </w:r>
+      <w:r>
+        <w:t xml:space="preserve"> </w:t>
+      </w:r>
+      <w:r>
+        <w:t>assignable; keep the Stage 3 method names and the validate() operation.</w:t>
       </w:r>
     </w:p>
     <w:p>
@@ -116,12 +670,211 @@
         <w:pStyle w:val="Heading1"/>
       </w:pPr>
       <w:r>
-        <w:t>F - Manual Behaviour Checks</w:t>
+        <w:t>E - Review Generated Code</w:t>
       </w:r>
     </w:p>
     <w:p>
       <w:r>
-        <w:t>Create valid objects, test invalid input, cancel a scheduled appointment and attempt an illegal repeated transition.</w:t>
+        <w:t>Check model consistency, unsupported features, public state mutation, unnecessary inheritance, invented dependencies and error handling.</w:t>
+      </w:r>
+    </w:p>
+    <w:p>
+      <w:pPr>
+        <w:pStyle w:val="Heading2"/>
+      </w:pPr>
+      <w:r>
+        <w:t>Model Consistency</w:t>
+      </w:r>
+    </w:p>
+    <w:p>
+      <w:r>
+        <w:t>Appointment has the same attributes and operations as the approved UML. Differences are the stat</w:t>
+      </w:r>
+      <w:r>
+        <w:t>us</w:t>
+      </w:r>
+      <w:r>
+        <w:t xml:space="preserve"> in an </w:t>
+      </w:r>
+      <w:proofErr w:type="spellStart"/>
+      <w:r>
+        <w:t>AppointmentStatus</w:t>
+      </w:r>
+      <w:proofErr w:type="spellEnd"/>
+      <w:r>
+        <w:t xml:space="preserve"> instead of a str</w:t>
+      </w:r>
+      <w:r>
+        <w:t xml:space="preserve">, and the </w:t>
+      </w:r>
+      <w:proofErr w:type="spellStart"/>
+      <w:r>
+        <w:t>enum</w:t>
+      </w:r>
+      <w:proofErr w:type="spellEnd"/>
+      <w:r>
+        <w:t xml:space="preserve"> and exception are new. Practitioner also gained </w:t>
+      </w:r>
+      <w:proofErr w:type="spellStart"/>
+      <w:r>
+        <w:t>apecialty</w:t>
+      </w:r>
+      <w:proofErr w:type="spellEnd"/>
+      <w:r>
+        <w:t>.</w:t>
+      </w:r>
+    </w:p>
+    <w:p>
+      <w:pPr>
+        <w:pStyle w:val="Heading2"/>
+      </w:pPr>
+      <w:r>
+        <w:t>Unsupported Features</w:t>
+      </w:r>
+    </w:p>
+    <w:p>
+      <w:r>
+        <w:t>No unsupported features were added</w:t>
+      </w:r>
+      <w:r>
+        <w:t xml:space="preserve">. Reschedule() and </w:t>
+      </w:r>
+      <w:proofErr w:type="spellStart"/>
+      <w:r>
+        <w:t>record_outcome</w:t>
+      </w:r>
+      <w:proofErr w:type="spellEnd"/>
+      <w:r>
+        <w:t>() remain stubs.</w:t>
+      </w:r>
+    </w:p>
+    <w:p>
+      <w:pPr>
+        <w:pStyle w:val="Heading2"/>
+      </w:pPr>
+      <w:r>
+        <w:t>Public State Mutation</w:t>
+      </w:r>
+    </w:p>
+    <w:p>
+      <w:r>
+        <w:t>When reading the code,</w:t>
+      </w:r>
+      <w:r>
+        <w:t xml:space="preserve"> </w:t>
+      </w:r>
+      <w:proofErr w:type="spellStart"/>
+      <w:r>
+        <w:t>appointment_id</w:t>
+      </w:r>
+      <w:proofErr w:type="spellEnd"/>
+      <w:r>
+        <w:t>, patient, practitioner, when, and status are read-only</w:t>
+      </w:r>
+      <w:r>
+        <w:t xml:space="preserve"> properties with no setters, and status only changes inside _</w:t>
+      </w:r>
+      <w:proofErr w:type="spellStart"/>
+      <w:r>
+        <w:t>change_status</w:t>
+      </w:r>
+      <w:proofErr w:type="spellEnd"/>
+      <w:r>
+        <w:t>()&lt; which cancel() calls.</w:t>
+      </w:r>
+      <w:r>
+        <w:br/>
+        <w:t>2 weak spots were found</w:t>
+      </w:r>
+      <w:r>
+        <w:t>: (a) the constructor still accepts a status argument</w:t>
+      </w:r>
+      <w:r>
+        <w:t xml:space="preserve">, so an appointment could be created already completed. (b) </w:t>
+      </w:r>
+      <w:proofErr w:type="spellStart"/>
+      <w:r>
+        <w:t>Practitioner</w:t>
+      </w:r>
+      <w:r>
+        <w:t>.appointments</w:t>
+      </w:r>
+      <w:proofErr w:type="spellEnd"/>
+      <w:r>
+        <w:t xml:space="preserve"> is a public list carried over so outside code could edit it. Neither</w:t>
+      </w:r>
+      <w:r>
+        <w:t xml:space="preserve"> is changed here, because the skeleton defined them and nothing uses them yet, both are flagged.</w:t>
+      </w:r>
+    </w:p>
+    <w:p>
+      <w:pPr>
+        <w:pStyle w:val="Heading2"/>
+      </w:pPr>
+      <w:r>
+        <w:t>Unnecessary Inheritance</w:t>
+      </w:r>
+    </w:p>
+    <w:p>
+      <w:r>
+        <w:t>None, all classes</w:t>
+      </w:r>
+      <w:r>
+        <w:t xml:space="preserve"> have no base class.</w:t>
+      </w:r>
+    </w:p>
+    <w:p>
+      <w:pPr>
+        <w:pStyle w:val="Heading2"/>
+      </w:pPr>
+      <w:r>
+        <w:lastRenderedPageBreak/>
+        <w:t>Inverted Dependencies</w:t>
+      </w:r>
+    </w:p>
+    <w:p>
+      <w:r>
+        <w:t xml:space="preserve">None, the imports are datetime, </w:t>
+      </w:r>
+      <w:proofErr w:type="spellStart"/>
+      <w:r>
+        <w:t>enum</w:t>
+      </w:r>
+      <w:proofErr w:type="spellEnd"/>
+      <w:r>
+        <w:t>, and typing only.</w:t>
+      </w:r>
+    </w:p>
+    <w:p>
+      <w:pPr>
+        <w:pStyle w:val="Heading2"/>
+      </w:pPr>
+      <w:r>
+        <w:t>Error Handling</w:t>
+      </w:r>
+    </w:p>
+    <w:p>
+      <w:r>
+        <w:t>Missing</w:t>
+      </w:r>
+      <w:r>
+        <w:t xml:space="preserve"> or wrong-type inputs raise </w:t>
+      </w:r>
+      <w:proofErr w:type="spellStart"/>
+      <w:r>
+        <w:t>ValueError</w:t>
+      </w:r>
+      <w:proofErr w:type="spellEnd"/>
+      <w:r>
+        <w:t xml:space="preserve">, an illegal status change raises </w:t>
+      </w:r>
+      <w:proofErr w:type="spellStart"/>
+      <w:r>
+        <w:t>InvalidStatusTransitionError</w:t>
+      </w:r>
+      <w:proofErr w:type="spellEnd"/>
+      <w:r>
+        <w:t>, nothing is silently swallowed.</w:t>
       </w:r>
     </w:p>
     <w:p>
@@ -129,12 +882,269 @@
         <w:pStyle w:val="Heading1"/>
       </w:pPr>
       <w:r>
-        <w:t>G - Refactor</w:t>
+        <w:t>F</w:t>
+      </w:r>
+      <w:r>
+        <w:t xml:space="preserve"> - Manual </w:t>
+      </w:r>
+      <w:proofErr w:type="spellStart"/>
+      <w:r>
+        <w:t>Behaviour</w:t>
+      </w:r>
+      <w:proofErr w:type="spellEnd"/>
+      <w:r>
+        <w:t xml:space="preserve"> Checks</w:t>
       </w:r>
     </w:p>
     <w:p>
       <w:r>
-        <w:t>Remove unnecessary code and make implementation simpler and design-consistent.</w:t>
+        <w:t>Create valid objects, test invalid input, cancel a scheduled appointment and attempt an illegal repeated transition.</w:t>
+      </w:r>
+    </w:p>
+    <w:p>
+      <w:proofErr w:type="spellStart"/>
+      <w:r>
+        <w:t>Behaviour</w:t>
+      </w:r>
+      <w:proofErr w:type="spellEnd"/>
+      <w:r>
+        <w:t xml:space="preserve"> checked by running manual_checks.py. Real output:</w:t>
+      </w:r>
+    </w:p>
+    <w:p>
+      <w:pPr>
+        <w:rPr>
+          <w:b/>
+          <w:bCs/>
+        </w:rPr>
+      </w:pPr>
+      <w:r>
+        <w:rPr>
+          <w:b/>
+          <w:bCs/>
+        </w:rPr>
+        <w:t>--- F1: create valid objects ---</w:t>
+      </w:r>
+      <w:r>
+        <w:rPr>
+          <w:b/>
+          <w:bCs/>
+        </w:rPr>
+        <w:br/>
+      </w:r>
+      <w:r>
+        <w:t>[PASS] Patient created with the values given</w:t>
+      </w:r>
+      <w:r>
+        <w:rPr>
+          <w:b/>
+          <w:bCs/>
+        </w:rPr>
+        <w:br/>
+      </w:r>
+      <w:r>
+        <w:t>[PASS] Practitioner created with id, name and specialty</w:t>
+      </w:r>
+      <w:r>
+        <w:rPr>
+          <w:b/>
+          <w:bCs/>
+        </w:rPr>
+        <w:br/>
+      </w:r>
+      <w:r>
+        <w:t>[PASS] Appointment starts SCHEDULED</w:t>
+      </w:r>
+    </w:p>
+    <w:p>
+      <w:pPr>
+        <w:rPr>
+          <w:b/>
+          <w:bCs/>
+        </w:rPr>
+      </w:pPr>
+      <w:r>
+        <w:rPr>
+          <w:b/>
+          <w:bCs/>
+        </w:rPr>
+        <w:t>--- F2: invalid input ---</w:t>
+      </w:r>
+      <w:r>
+        <w:rPr>
+          <w:b/>
+          <w:bCs/>
+        </w:rPr>
+        <w:br/>
+      </w:r>
+      <w:r>
+        <w:t>[PASS] Blank patient name rejected</w:t>
+      </w:r>
+      <w:r>
+        <w:rPr>
+          <w:b/>
+          <w:bCs/>
+        </w:rPr>
+        <w:br/>
+      </w:r>
+      <w:r>
+        <w:t>[PASS] Missing patient id rejected</w:t>
+      </w:r>
+      <w:r>
+        <w:rPr>
+          <w:b/>
+          <w:bCs/>
+        </w:rPr>
+        <w:br/>
+      </w:r>
+      <w:r>
+        <w:t>[</w:t>
+      </w:r>
+      <w:r>
+        <w:t>PASS] Non-text phone rejected</w:t>
+      </w:r>
+      <w:r>
+        <w:rPr>
+          <w:b/>
+          <w:bCs/>
+        </w:rPr>
+        <w:br/>
+      </w:r>
+      <w:r>
+        <w:t>[PASS] Blank specialty rejected</w:t>
+      </w:r>
+      <w:r>
+        <w:rPr>
+          <w:b/>
+          <w:bCs/>
+        </w:rPr>
+        <w:br/>
+      </w:r>
+      <w:r>
+        <w:t>[PASS] Appointment without a patient rejected</w:t>
+      </w:r>
+      <w:r>
+        <w:rPr>
+          <w:b/>
+          <w:bCs/>
+        </w:rPr>
+        <w:br/>
+      </w:r>
+      <w:r>
+        <w:t>[PASS] Appointment with a text time rejected</w:t>
+      </w:r>
+      <w:r>
+        <w:rPr>
+          <w:b/>
+          <w:bCs/>
+        </w:rPr>
+        <w:br/>
+      </w:r>
+      <w:r>
+        <w:t>[PASS] Appointment with a made-up status rejected</w:t>
+      </w:r>
+      <w:r>
+        <w:rPr>
+          <w:b/>
+          <w:bCs/>
+        </w:rPr>
+        <w:br/>
+      </w:r>
+      <w:r>
+        <w:t>[PASS] status cannot be assigned directly</w:t>
+      </w:r>
+    </w:p>
+    <w:p>
+      <w:pPr>
+        <w:rPr>
+          <w:b/>
+          <w:bCs/>
+        </w:rPr>
+      </w:pPr>
+      <w:r>
+        <w:rPr>
+          <w:b/>
+          <w:bCs/>
+        </w:rPr>
+        <w:t>--- F3: cancel a scheduled appointment ---</w:t>
+      </w:r>
+      <w:r>
+        <w:rPr>
+          <w:b/>
+          <w:bCs/>
+        </w:rPr>
+        <w:br/>
+      </w:r>
+      <w:r>
+        <w:t>[PASS] Status is now CANCELLED</w:t>
+      </w:r>
+      <w:r>
+        <w:rPr>
+          <w:b/>
+          <w:bCs/>
+        </w:rPr>
+        <w:br/>
+      </w:r>
+      <w:r>
+        <w:t>[PASS] The cancelled appointment still exists as an object</w:t>
+      </w:r>
+    </w:p>
+    <w:p>
+      <w:pPr>
+        <w:rPr>
+          <w:b/>
+          <w:bCs/>
+        </w:rPr>
+      </w:pPr>
+      <w:r>
+        <w:rPr>
+          <w:b/>
+          <w:bCs/>
+        </w:rPr>
+        <w:t>--- F4: illegal repeated transition ---</w:t>
+      </w:r>
+      <w:r>
+        <w:rPr>
+          <w:b/>
+          <w:bCs/>
+        </w:rPr>
+        <w:br/>
+      </w:r>
+      <w:r>
+        <w:t xml:space="preserve">[PASS] Cancelling again raises </w:t>
+      </w:r>
+      <w:proofErr w:type="spellStart"/>
+      <w:r>
+        <w:t>InvalidStatusTransitionError</w:t>
+      </w:r>
+      <w:proofErr w:type="spellEnd"/>
+      <w:r>
+        <w:rPr>
+          <w:b/>
+          <w:bCs/>
+        </w:rPr>
+        <w:br/>
+      </w:r>
+      <w:r>
+        <w:t xml:space="preserve">[PASS] Status is unchanged after the illegal attempt </w:t>
+      </w:r>
+    </w:p>
+    <w:p>
+      <w:r>
+        <w:t>15/15 checks passed</w:t>
+      </w:r>
+    </w:p>
+    <w:p>
+      <w:r>
+        <w:t xml:space="preserve">F1 creates valid objects, F2 tries invalid input, F3 cancels a scheduled appointment, and F4 cancels the same appointment again, which raises </w:t>
+      </w:r>
+      <w:proofErr w:type="spellStart"/>
+      <w:r>
+        <w:t>InvalidStatusTransitionError</w:t>
+      </w:r>
+      <w:proofErr w:type="spellEnd"/>
+      <w:r>
+        <w:t xml:space="preserve"> and leaves the status unchanged.</w:t>
       </w:r>
     </w:p>
     <w:p>
@@ -142,12 +1152,59 @@
         <w:pStyle w:val="Heading1"/>
       </w:pPr>
       <w:r>
-        <w:t>H - AI Engineering Log</w:t>
+        <w:t>G - Refactor</w:t>
       </w:r>
     </w:p>
     <w:p>
       <w:r>
-        <w:t>Record prompt, generated contribution, decisions and verification evidence.</w:t>
+        <w:t>Remove unnecessary code and make implementation simpler and design-consistent.</w:t>
+      </w:r>
+    </w:p>
+    <w:p>
+      <w:r>
+        <w:t xml:space="preserve">Removed imports carried over from the skeleton that nothing uses (e.g. </w:t>
+      </w:r>
+      <w:proofErr w:type="spellStart"/>
+      <w:r>
+        <w:t>dataclass</w:t>
+      </w:r>
+      <w:proofErr w:type="spellEnd"/>
+      <w:r>
+        <w:t>, field, optional).</w:t>
+      </w:r>
+      <w:r>
+        <w:br/>
+      </w:r>
+      <w:r>
+        <w:t>The skeleton</w:t>
+      </w:r>
+      <w:r>
+        <w:t>’s header said methods were empty and returned None</w:t>
+      </w:r>
+      <w:r>
+        <w:br/>
+        <w:t>Fixed the spelling in comments and error messages the were carried over from the skelet</w:t>
+      </w:r>
+      <w:r>
+        <w:t>on (appointment, appointments, reschedule, minimal)</w:t>
+      </w:r>
+      <w:r>
+        <w:br/>
+      </w:r>
+      <w:r>
+        <w:lastRenderedPageBreak/>
+        <w:t xml:space="preserve">Checked every class, attribute, and operation name against the UML. All match, apart from the 2 </w:t>
+      </w:r>
+      <w:proofErr w:type="spellStart"/>
+      <w:r>
+        <w:t>decisioms</w:t>
+      </w:r>
+      <w:proofErr w:type="spellEnd"/>
+      <w:r>
+        <w:t xml:space="preserve"> made in part A and the changes the prompts asked for</w:t>
+      </w:r>
+      <w:r>
+        <w:t>.</w:t>
       </w:r>
     </w:p>
     <w:p>
@@ -155,13 +1212,122 @@
         <w:pStyle w:val="Heading1"/>
       </w:pPr>
       <w:r>
-        <w:lastRenderedPageBreak/>
-        <w:t>Suggested AI prompt</w:t>
+        <w:t>H - AI Engineering Log</w:t>
       </w:r>
     </w:p>
     <w:p>
       <w:r>
-        <w:t>Act as a Python pair programmer. Implement only the Appointment class from the approved SmartCare UML. Use type hints and an AppointmentStatus enum. Cancelled appointments remain as objects. Do not add database, UI, notification or service classes. Protect status transitions and explain any decision not directly visible in the UML.</w:t>
+        <w:t>Record prompt, generated contribution, decisions and verification evidence.</w:t>
+      </w:r>
+    </w:p>
+    <w:p>
+      <w:pPr>
+        <w:pStyle w:val="Heading2"/>
+      </w:pPr>
+      <w:r>
+        <w:t>Prompt</w:t>
+      </w:r>
+    </w:p>
+    <w:p>
+      <w:r>
+        <w:t>Recorded in Part D</w:t>
+      </w:r>
+    </w:p>
+    <w:p>
+      <w:pPr>
+        <w:pStyle w:val="Heading2"/>
+      </w:pPr>
+      <w:r>
+        <w:t>Generated Contribution</w:t>
+      </w:r>
+    </w:p>
+    <w:p>
+      <w:r>
+        <w:t xml:space="preserve">The </w:t>
+      </w:r>
+      <w:proofErr w:type="spellStart"/>
+      <w:r>
+        <w:t>AppointmentStatus</w:t>
+      </w:r>
+      <w:proofErr w:type="spellEnd"/>
+      <w:r>
+        <w:t xml:space="preserve"> </w:t>
+      </w:r>
+      <w:proofErr w:type="spellStart"/>
+      <w:r>
+        <w:t>enum</w:t>
+      </w:r>
+      <w:proofErr w:type="spellEnd"/>
+      <w:r>
+        <w:t xml:space="preserve">, </w:t>
+      </w:r>
+      <w:proofErr w:type="spellStart"/>
+      <w:r>
+        <w:t>InvalidStatusTransitionError</w:t>
+      </w:r>
+      <w:proofErr w:type="spellEnd"/>
+      <w:r>
+        <w:t>, and the Appointment class</w:t>
+      </w:r>
+      <w:r>
+        <w:t>.</w:t>
+      </w:r>
+    </w:p>
+    <w:p>
+      <w:pPr>
+        <w:pStyle w:val="Heading2"/>
+      </w:pPr>
+      <w:r>
+        <w:t>Decisions</w:t>
+      </w:r>
+    </w:p>
+    <w:p>
+      <w:r>
+        <w:t xml:space="preserve">Accepted the </w:t>
+      </w:r>
+      <w:proofErr w:type="spellStart"/>
+      <w:r>
+        <w:t>enum</w:t>
+      </w:r>
+      <w:proofErr w:type="spellEnd"/>
+      <w:r>
+        <w:t xml:space="preserve"> and exception, accepted a private status with one guarded route for changes, rejected an earlier Ai draft that went beyond the</w:t>
+      </w:r>
+      <w:r>
+        <w:t xml:space="preserve"> approved design</w:t>
+      </w:r>
+      <w:r>
+        <w:t xml:space="preserve"> </w:t>
+      </w:r>
+      <w:r>
+        <w:t>(extra parameters, a new public method, phone-number rules, and reschedule and conflict logic that the prompt and requirements never asked for),</w:t>
+      </w:r>
+      <w:r>
+        <w:t xml:space="preserve"> and rebuilt from the stage 3 skeleton instead. Kept the </w:t>
+      </w:r>
+      <w:proofErr w:type="spellStart"/>
+      <w:r>
+        <w:t>constructor;s</w:t>
+      </w:r>
+      <w:proofErr w:type="spellEnd"/>
+      <w:r>
+        <w:t xml:space="preserve"> status argument and the public appointments list from stage 3 and </w:t>
+      </w:r>
+      <w:r>
+        <w:t>flagged them in part E.</w:t>
+      </w:r>
+    </w:p>
+    <w:p>
+      <w:pPr>
+        <w:pStyle w:val="Heading2"/>
+      </w:pPr>
+      <w:r>
+        <w:t>Verification Evidence</w:t>
+      </w:r>
+    </w:p>
+    <w:p>
+      <w:r>
+        <w:t>The part F output (15/15 passed checks), and the part E code review.</w:t>
       </w:r>
     </w:p>
     <w:p>
@@ -169,12 +1335,76 @@
         <w:pStyle w:val="Heading1"/>
       </w:pPr>
       <w:r>
-        <w:t>Reflection</w:t>
+        <w:t>Suggested AI prompt</w:t>
       </w:r>
     </w:p>
     <w:p>
       <w:r>
+        <w:t xml:space="preserve">Act as a Python pair programmer. Implement only the Appointment class from the approved SmartCare UML. Use type hints and an </w:t>
+      </w:r>
+      <w:proofErr w:type="spellStart"/>
+      <w:r>
+        <w:t>AppointmentStatus</w:t>
+      </w:r>
+      <w:proofErr w:type="spellEnd"/>
+      <w:r>
+        <w:t xml:space="preserve"> </w:t>
+      </w:r>
+      <w:proofErr w:type="spellStart"/>
+      <w:r>
+        <w:t>enum</w:t>
+      </w:r>
+      <w:proofErr w:type="spellEnd"/>
+      <w:r>
+        <w:t>. Cancelled appointments remain as objects. Do not add database, UI, notification or service classes. Protect status transitions and explain any decision not directly visible in the UML.</w:t>
+      </w:r>
+    </w:p>
+    <w:p>
+      <w:pPr>
+        <w:pStyle w:val="Heading1"/>
+      </w:pPr>
+      <w:r>
+        <w:t>Reflection</w:t>
+      </w:r>
+    </w:p>
+    <w:p>
+      <w:r>
         <w:t>Which AI-generated part did you modify or reject? Why? How did the approved design constrain the AI?</w:t>
+      </w:r>
+    </w:p>
+    <w:p>
+      <w:r>
+        <w:t>I rejected an earlier Ai draft that went well beyond what I had approved. It added extra parameters, a new public method, and rules about the phone numbers and rescheduling that neither the UML nor the requirements asked for.</w:t>
+      </w:r>
+      <w:r>
+        <w:t xml:space="preserve"> I kept only what the prompts required; specialty, the status </w:t>
+      </w:r>
+      <w:proofErr w:type="spellStart"/>
+      <w:r>
+        <w:t>enum</w:t>
+      </w:r>
+      <w:proofErr w:type="spellEnd"/>
+      <w:r>
+        <w:t>, the exception, and a protected way to change status.</w:t>
+      </w:r>
+    </w:p>
+    <w:p>
+      <w:r>
+        <w:t>The approved design constrained</w:t>
+      </w:r>
+      <w:r>
+        <w:t xml:space="preserve"> the Ai by fixing which classes exist and what each one is responsible for, so it now had no room to add</w:t>
+      </w:r>
+      <w:r>
+        <w:t xml:space="preserve"> any additional classes, and every method it wrote had to match a name I already had in</w:t>
+      </w:r>
+      <w:r>
+        <w:t xml:space="preserve"> the UML. The requirements did the rest, cancelled appointments stay as history, so cancel() only changes the status.</w:t>
+      </w:r>
+    </w:p>
+    <w:p>
+      <w:r>
+        <w:t>The only thing I would still confirm is whether a new appointment should be allowed to start in any status other than scheduled.</w:t>
       </w:r>
     </w:p>
     <w:sectPr>
@@ -188,7 +1418,7 @@
 </file>
 
 <file path=word/numbering.xml><?xml version="1.0" encoding="utf-8"?>
-<w:numbering xmlns:wpc="http://schemas.microsoft.com/office/word/2010/wordprocessingCanvas" xmlns:cx="http://schemas.microsoft.com/office/drawing/2014/chartex" xmlns:cx1="http://schemas.microsoft.com/office/drawing/2015/9/8/chartex" xmlns:cx2="http://schemas.microsoft.com/office/drawing/2015/10/21/chartex" xmlns:cx3="http://schemas.microsoft.com/office/drawing/2016/5/9/chartex" xmlns:cx4="http://schemas.microsoft.com/office/drawing/2016/5/10/chartex" xmlns:cx5="http://schemas.microsoft.com/office/drawing/2016/5/11/chartex" xmlns:cx6="http://schemas.microsoft.com/office/drawing/2016/5/12/chartex" xmlns:cx7="http://schemas.microsoft.com/office/drawing/2016/5/13/chartex" xmlns:cx8="http://schemas.microsoft.com/office/drawing/2016/5/14/chartex" xmlns:mc="http://schemas.openxmlformats.org/markup-compatibility/2006" xmlns:aink="http://schemas.microsoft.com/office/drawing/2016/ink" xmlns:am3d="http://schemas.microsoft.com/office/drawing/2017/model3d" xmlns:o="urn:schemas-microsoft-com:office:office" xmlns:oel="http://schemas.microsoft.com/office/2019/extlst" xmlns:r="http://schemas.openxmlformats.org/officeDocument/2006/relationships" xmlns:m="http://schemas.openxmlformats.org/officeDocument/2006/math" xmlns:v="urn:schemas-microsoft-com:vml" xmlns:wp14="http://schemas.microsoft.com/office/word/2010/wordprocessingDrawing" xmlns:wp="http://schemas.openxmlformats.org/drawingml/2006/wordprocessingDrawing" xmlns:w10="urn:schemas-microsoft-com:office:word" xmlns:w="http://schemas.openxmlformats.org/wordprocessingml/2006/main" xmlns:w14="http://schemas.microsoft.com/office/word/2010/wordml" xmlns:w15="http://schemas.microsoft.com/office/word/2012/wordml" xmlns:w16cei="http://schemas.microsoft.com/office/word/2026/wordml/cei" xmlns:w16cex="http://schemas.microsoft.com/office/word/2018/wordml/cex" xmlns:w16cid="http://schemas.microsoft.com/office/word/2016/wordml/cid" xmlns:w16="http://schemas.microsoft.com/office/word/2018/wordml" xmlns:w16du="http://schemas.microsoft.com/office/word/2023/wordml/word16du" xmlns:w16sdtdh="http://schemas.microsoft.com/office/word/2020/wordml/sdtdatahash" xmlns:w16sdtfl="http://schemas.microsoft.com/office/word/2024/wordml/sdtformatlock" xmlns:w16se="http://schemas.microsoft.com/office/word/2015/wordml/symex" xmlns:wpg="http://schemas.microsoft.com/office/word/2010/wordprocessingGroup" xmlns:wpi="http://schemas.microsoft.com/office/word/2010/wordprocessingInk" xmlns:wne="http://schemas.microsoft.com/office/word/2006/wordml" xmlns:wps="http://schemas.microsoft.com/office/word/2010/wordprocessingShape" mc:Ignorable="w14 w15 w16se w16cid w16 w16cex w16sdtdh w16sdtfl w16du wp14">
+<w:numbering xmlns:wpc="http://schemas.microsoft.com/office/word/2010/wordprocessingCanvas" xmlns:cx="http://schemas.microsoft.com/office/drawing/2014/chartex" xmlns:cx1="http://schemas.microsoft.com/office/drawing/2015/9/8/chartex" xmlns:cx2="http://schemas.microsoft.com/office/drawing/2015/10/21/chartex" xmlns:cx3="http://schemas.microsoft.com/office/drawing/2016/5/9/chartex" xmlns:cx4="http://schemas.microsoft.com/office/drawing/2016/5/10/chartex" xmlns:cx5="http://schemas.microsoft.com/office/drawing/2016/5/11/chartex" xmlns:cx6="http://schemas.microsoft.com/office/drawing/2016/5/12/chartex" xmlns:cx7="http://schemas.microsoft.com/office/drawing/2016/5/13/chartex" xmlns:cx8="http://schemas.microsoft.com/office/drawing/2016/5/14/chartex" xmlns:mc="http://schemas.openxmlformats.org/markup-compatibility/2006" xmlns:aink="http://schemas.microsoft.com/office/drawing/2016/ink" xmlns:am3d="http://schemas.microsoft.com/office/drawing/2017/model3d" xmlns:o="urn:schemas-microsoft-com:office:office" xmlns:oel="http://schemas.microsoft.com/office/2019/extlst" xmlns:r="http://schemas.openxmlformats.org/officeDocument/2006/relationships" xmlns:m="http://schemas.openxmlformats.org/officeDocument/2006/math" xmlns:v="urn:schemas-microsoft-com:vml" xmlns:wp14="http://schemas.microsoft.com/office/word/2010/wordprocessingDrawing" xmlns:wp="http://schemas.openxmlformats.org/drawingml/2006/wordprocessingDrawing" xmlns:w10="urn:schemas-microsoft-com:office:word" xmlns:w="http://schemas.openxmlformats.org/wordprocessingml/2006/main" xmlns:w14="http://schemas.microsoft.com/office/word/2010/wordml" xmlns:w15="http://schemas.microsoft.com/office/word/2012/wordml" xmlns:w16cex="http://schemas.microsoft.com/office/word/2018/wordml/cex" xmlns:w16cid="http://schemas.microsoft.com/office/word/2016/wordml/cid" xmlns:w16="http://schemas.microsoft.com/office/word/2018/wordml" xmlns:w16du="http://schemas.microsoft.com/office/word/2023/wordml/word16du" xmlns:w16sdtdh="http://schemas.microsoft.com/office/word/2020/wordml/sdtdatahash" xmlns:w16sdtfl="http://schemas.microsoft.com/office/word/2024/wordml/sdtformatlock" xmlns:w16se="http://schemas.microsoft.com/office/word/2015/wordml/symex" xmlns:wpg="http://schemas.microsoft.com/office/word/2010/wordprocessingGroup" xmlns:wpi="http://schemas.microsoft.com/office/word/2010/wordprocessingInk" xmlns:wne="http://schemas.microsoft.com/office/word/2006/wordml" xmlns:wps="http://schemas.microsoft.com/office/word/2010/wordprocessingShape" mc:Ignorable="w14 w15 w16se w16cid w16 w16cex w16sdtdh w16sdtfl w16du wp14">
   <w:abstractNum w:abstractNumId="0" w15:restartNumberingAfterBreak="0">
     <w:nsid w:val="FFFFFF7C"/>
     <w:multiLevelType w:val="singleLevel"/>
@@ -997,7 +2227,6 @@
   <w:style w:type="character" w:default="1" w:styleId="DefaultParagraphFont">
     <w:name w:val="Default Paragraph Font"/>
     <w:uiPriority w:val="1"/>
-    <w:semiHidden/>
     <w:unhideWhenUsed/>
   </w:style>
   <w:style w:type="table" w:default="1" w:styleId="TableNormal">

</xml_diff>